<commit_message>
Corrige nome de Juiz de Fora, ajusta Gráficos 5/6/13 e regenera os três documentos
- RGInt_SRE_MUN_UF.xlsx: corrige "Juíz de Fora" -> "Juiz de Fora" (sem acento no I)
  nas 3 planilhas de correspondência; reprocessa analise/indicadores_ideb_mg.xlsx
- Gráfico 5: rótulos das barras e eixo passam a usar "p.p." em vez de "%"; nota
  de rodapé e texto ajustados para descrever corretamente a fórmula (variação
  percentual relativa)
- Gráfico 6: remove linhas de grade horizontais
- Gráfico 13: hachura as RGInt com mediana do Ideb abaixo da mediana estadual
- Regenera os 13 gráficos e reconstrói rascunho_informativo_ideb_2025.docx,
  informativo_ideb_2025_v2.docx (novo arquivo) e informativo_ideb_2026_v1_revisado.docx
  (figuras e notas atualizadas via cirurgia de XML, preservando o texto da equipe)
</commit_message>
<xml_diff>
--- a/informativo_ideb_2026_v1_revisado.docx
+++ b/informativo_ideb_2026_v1_revisado.docx
@@ -846,7 +846,7 @@
         <w:rPr/>
         <w:drawing>
           <wp:inline distB="114300" distT="114300" distL="114300" distR="114300">
-            <wp:extent cx="6163000" cy="2588908"/>
+            <wp:extent cx="6163000" cy="2812420"/>
             <wp:effectExtent b="0" l="0" r="0" t="0"/>
             <wp:docPr id="2102461777" name="image7.png"/>
             <a:graphic>
@@ -866,7 +866,7 @@
                   <pic:spPr>
                     <a:xfrm>
                       <a:off x="0" y="0"/>
-                      <a:ext cx="6163000" cy="2588908"/>
+                      <a:ext cx="6163000" cy="2812420"/>
                     </a:xfrm>
                     <a:prstGeom prst="rect"/>
                     <a:ln/>
@@ -919,7 +919,7 @@
           <w:szCs w:val="17"/>
           <w:rtl w:val="0"/>
         </w:rPr>
-        <w:t xml:space="preserve">Nota: barras hachuradas (rede Municipal) indicam aproximação pela média simples dos municípios de MG. As variações do Gráfico 5 são percentuais relativas (não pontos percentuais), calculadas como (valor 2025 − valor 2023) / valor 2023 × 100.</w:t>
+        <w:t xml:space="preserve">Nota: barras hachuradas (rede Municipal) indicam aproximação pela média simples dos municípios de MG. As variações do Gráfico 5 correspondem a variações percentuais relativas, calculadas como (valor 2025 − valor 2023) / valor 2023 × 100.</w:t>
       </w:r>
       <w:r>
         <w:rPr>
@@ -1759,7 +1759,7 @@
         <w:rPr/>
         <w:drawing>
           <wp:inline distB="114300" distT="114300" distL="114300" distR="114300">
-            <wp:extent cx="6163000" cy="3631923"/>
+            <wp:extent cx="6163000" cy="3735940"/>
             <wp:effectExtent b="0" l="0" r="0" t="0"/>
             <wp:docPr id="3100000002" name="image12.png"/>
             <a:graphic>
@@ -1779,7 +1779,7 @@
                   <pic:spPr>
                     <a:xfrm>
                       <a:off x="0" y="0"/>
-                      <a:ext cx="6163000" cy="3631923"/>
+                      <a:ext cx="6163000" cy="3735940"/>
                     </a:xfrm>
                     <a:prstGeom prst="rect"/>
                     <a:ln/>
@@ -1921,7 +1921,7 @@
         <w:rPr/>
         <w:drawing>
           <wp:inline distB="114300" distT="114300" distL="114300" distR="114300">
-            <wp:extent cx="6163000" cy="5271919"/>
+            <wp:extent cx="6163000" cy="5376313"/>
             <wp:effectExtent b="0" l="0" r="0" t="0"/>
             <wp:docPr id="3100000003" name="image13.png"/>
             <a:graphic>
@@ -1941,7 +1941,7 @@
                   <pic:spPr>
                     <a:xfrm>
                       <a:off x="0" y="0"/>
-                      <a:ext cx="6163000" cy="5271919"/>
+                      <a:ext cx="6163000" cy="5376313"/>
                     </a:xfrm>
                     <a:prstGeom prst="rect"/>
                     <a:ln/>
@@ -1994,7 +1994,7 @@
           <w:szCs w:val="17"/>
           <w:rtl w:val="0"/>
         </w:rPr>
-        <w:t xml:space="preserve">Nota: o Gráfico 13 mostra a mediana do Ideb das escolas estaduais no ensino médio por RGInt; linha tracejada é o Ideb da rede estadual de MG nessa etapa (4,5).</w:t>
+        <w:t xml:space="preserve">Nota: o Gráfico 13 mostra a mediana do Ideb das escolas estaduais no ensino médio por RGInt; linha tracejada é o Ideb da rede estadual de MG nessa etapa (4,5); hachurado indica RGInt com mediana abaixo da estadual.</w:t>
       </w:r>
       <w:r>
         <w:rPr>

</xml_diff>